<commit_message>
add folder of structer 1.0
</commit_message>
<xml_diff>
--- a/structer/struct picture.docx
+++ b/structer/struct picture.docx
@@ -5,10 +5,10 @@
     <w:p>
       <w:r>
         <w:drawing>
-          <wp:inline distT="0" distB="0" distL="0" distR="0" wp14:anchorId="67BB9477" wp14:editId="4F7CD3FC">
-            <wp:extent cx="5943600" cy="2967355"/>
-            <wp:effectExtent l="0" t="0" r="0" b="4445"/>
-            <wp:docPr id="2137813640" name="Picture 1"/>
+          <wp:inline distT="0" distB="0" distL="0" distR="0" wp14:anchorId="3801378E" wp14:editId="21BD1E13">
+            <wp:extent cx="5943600" cy="3075305"/>
+            <wp:effectExtent l="0" t="0" r="0" b="0"/>
+            <wp:docPr id="1431869112" name="Picture 1"/>
             <wp:cNvGraphicFramePr>
               <a:graphicFrameLocks xmlns:a="http://schemas.openxmlformats.org/drawingml/2006/main" noChangeAspect="1"/>
             </wp:cNvGraphicFramePr>
@@ -16,11 +16,11 @@
               <a:graphicData uri="http://schemas.openxmlformats.org/drawingml/2006/picture">
                 <pic:pic xmlns:pic="http://schemas.openxmlformats.org/drawingml/2006/picture">
                   <pic:nvPicPr>
-                    <pic:cNvPr id="2137813640" name=""/>
+                    <pic:cNvPr id="1431869112" name=""/>
                     <pic:cNvPicPr/>
                   </pic:nvPicPr>
                   <pic:blipFill>
-                    <a:blip r:embed="rId4"/>
+                    <a:blip r:embed="rId5"/>
                     <a:stretch>
                       <a:fillRect/>
                     </a:stretch>
@@ -28,7 +28,7 @@
                   <pic:spPr>
                     <a:xfrm>
                       <a:off x="0" y="0"/>
-                      <a:ext cx="5943600" cy="2967355"/>
+                      <a:ext cx="5943600" cy="3075305"/>
                     </a:xfrm>
                     <a:prstGeom prst="rect">
                       <a:avLst/>
@@ -39,6 +39,9 @@
             </a:graphic>
           </wp:inline>
         </w:drawing>
+      </w:r>
+      <w:r>
+        <w:t xml:space="preserve"> </w:t>
       </w:r>
     </w:p>
     <w:sectPr>
@@ -775,4 +778,16 @@
     </a:ext>
   </a:extLst>
 </a:theme>
+</file>
+
+<file path=customXml/item1.xml><?xml version="1.0" encoding="utf-8"?>
+<b:Sources xmlns:b="http://schemas.openxmlformats.org/officeDocument/2006/bibliography" xmlns="http://schemas.openxmlformats.org/officeDocument/2006/bibliography" SelectedStyle="\APASixthEditionOfficeOnline.xsl" StyleName="APA" Version="6"/>
+</file>
+
+<file path=customXml/itemProps1.xml><?xml version="1.0" encoding="utf-8"?>
+<ds:datastoreItem xmlns:ds="http://schemas.openxmlformats.org/officeDocument/2006/customXml" ds:itemID="{01BA8A3D-371E-41ED-A2B3-4B4C71232B70}">
+  <ds:schemaRefs>
+    <ds:schemaRef ds:uri="http://schemas.openxmlformats.org/officeDocument/2006/bibliography"/>
+  </ds:schemaRefs>
+</ds:datastoreItem>
 </file>
</xml_diff>